<commit_message>
docs(report): update exam project description
</commit_message>
<xml_diff>
--- a/docs/TaskFlow_AI_Project_Description.docx
+++ b/docs/TaskFlow_AI_Project_Description.docx
@@ -439,6 +439,9 @@
       <w:r>
         <w:t>The application follows a layered architecture consisting of an API layer, business services, repository layer and database access. This separation improves maintainability, scalability and testing.</w:t>
       </w:r>
+      <w:r>
+        <w:t xml:space="preserve"> Requests are processed through the FastAPI API layer, validated using Pydantic schemas, handled by business services, persisted through the repository layer using SQLAlchemy ORM, and stored in the SQLite database. This layered design improves maintainability, scalability, testability and clear separation of responsibilities.</w:t>
+      </w:r>
     </w:p>
     <w:p>
       <w:r>
@@ -572,6 +575,12 @@
       <w:r>
         <w:t>• Design JWT authentication architecture for FastAPI.</w:t>
       </w:r>
+      <w:r>
+        <w:br/>
+        <w:t>• Generate login and registration endpoints with JWT authentication.</w:t>
+        <w:br/>
+        <w:t>• Refactor authentication services using dependency injection.</w:t>
+      </w:r>
     </w:p>
     <w:p>
       <w:pPr>
@@ -646,6 +655,12 @@
       <w:r>
         <w:t>• Generate CRUD endpoints for projects and tasks.</w:t>
       </w:r>
+      <w:r>
+        <w:br/>
+        <w:t>• Create SQLAlchemy models for Project and Task.</w:t>
+        <w:br/>
+        <w:t>• Improve validation using Pydantic schemas.</w:t>
+      </w:r>
     </w:p>
     <w:p>
       <w:pPr>
@@ -719,6 +734,12 @@
       <w:r>
         <w:t>• Generate project completion statistics and KPIs.</w:t>
       </w:r>
+      <w:r>
+        <w:br/>
+        <w:t>• Suggest a rule-based recommendation engine.</w:t>
+        <w:br/>
+        <w:t>• Refactor analytics services for better separation of concerns.</w:t>
+      </w:r>
     </w:p>
     <w:p>
       <w:pPr>
@@ -791,6 +812,12 @@
     <w:p>
       <w:r>
         <w:t>• Implement notification processing using BackgroundTasks.</w:t>
+      </w:r>
+      <w:r>
+        <w:br/>
+        <w:t>• Create background job services for queued notifications.</w:t>
+        <w:br/>
+        <w:t>• Add structured logging and exception handling.</w:t>
       </w:r>
     </w:p>
     <w:p>
@@ -1222,7 +1249,7 @@
     </w:p>
     <w:p>
       <w:r>
-        <w:t>The project demonstrates effective AI-assisted software development using Claude, GitHub Copilot and ChatGPT. AI tools accelerated development, while all important design decisions, testing and integration were performed manually. The result is a modular, maintainable FastAPI application that follows modern software engineering practices for an exam-scale project. AI-generated code was manually reviewed, adapted to the project architecture, tested and refactored before integration, ensuring maintainability and software quality.</w:t>
+        <w:t>The project demonstrates effective AI-assisted software development using Claude, GitHub Copilot and ChatGPT. AI tools accelerated development, while all important design decisions, testing and integration were performed manually. The result is a modular, maintainable FastAPI application that follows modern software engineering practices for an exam-scale project. AI-generated code was manually reviewed, adapted to the project architecture, tested and refactored before integration, ensuring maintainability and software quality. The project also demonstrates how AI can significantly accelerate software development while keeping the developer responsible for architecture, validation, testing and final code quality.</w:t>
       </w:r>
     </w:p>
     <w:sectPr>

</xml_diff>